<commit_message>
Update Categoria II split: 30% médico / 70% fisioterapeuta
Adjusts the adaptation/therapy service revenue distribution from
100% physiotherapist to 70/30 (physio/medical), reflecting the
medical partner's contribution through diagnosis and prescription.

https://claude.ai/code/session_01CsphWZFVmVshBkdbdvwdvU
</commit_message>
<xml_diff>
--- a/docs/contrato-social-aresvida.docx
+++ b/docs/contrato-social-aresvida.docx
@@ -2044,7 +2044,7 @@
                 <w:i w:val="0"/>
                 <w:sz w:val="20"/>
               </w:rPr>
-              <w:t>Sócio B (Fisioterapeuta)</w:t>
+              <w:t>Sócio A (Médico)</w:t>
             </w:r>
           </w:p>
         </w:tc>
@@ -2064,7 +2064,7 @@
                 <w:i w:val="0"/>
                 <w:sz w:val="20"/>
               </w:rPr>
-              <w:t>100%</w:t>
+              <w:t>30%</w:t>
             </w:r>
           </w:p>
         </w:tc>
@@ -2086,7 +2086,7 @@
                 <w:i w:val="0"/>
                 <w:sz w:val="20"/>
               </w:rPr>
-              <w:t>Sócio A (Médico)</w:t>
+              <w:t>Sócio B (Fisioterapeuta)</w:t>
             </w:r>
           </w:p>
         </w:tc>
@@ -2106,7 +2106,7 @@
                 <w:i w:val="0"/>
                 <w:sz w:val="20"/>
               </w:rPr>
-              <w:t>0%</w:t>
+              <w:t>70%</w:t>
             </w:r>
           </w:p>
         </w:tc>
@@ -2135,7 +2135,7 @@
           <w:i w:val="0"/>
           <w:sz w:val="22"/>
         </w:rPr>
-        <w:t xml:space="preserve"> A integralidade da receita líquida dos serviços de adaptação e acompanhamento terapêutico remunera exclusivamente o Sócio B, em reconhecimento à sua habilitação profissional específica (CREFITO), à sua dedicação técnica e à responsabilidade clínica sobre esses serviços.</w:t>
+        <w:t xml:space="preserve"> A maior parcela da receita líquida dos serviços de adaptação e acompanhamento terapêutico (70%) remunera o Sócio B, em reconhecimento à sua habilitação profissional específica (CREFITO), à sua dedicação técnica e à responsabilidade clínica exclusiva sobre esses serviços.</w:t>
       </w:r>
     </w:p>
     <w:p>
@@ -2160,7 +2160,32 @@
           <w:i w:val="0"/>
           <w:sz w:val="22"/>
         </w:rPr>
-        <w:t xml:space="preserve"> O Sócio A (Médico) reconhece que os serviços de adaptação são de competência exclusiva do fisioterapeuta, e não poderá executá-los, cobrá-los ou perceber receita deles individualmente ou em nome da sociedade, salvo se vier a obter habilitação profissional equivalente reconhecida pelo CREFITO.</w:t>
+        <w:t xml:space="preserve"> A participação do Sócio A (30%) na receita de adaptação reconhece sua contribuição na captação de pacientes por meio de laudos e diagnósticos, na prescrição dos equipamentos e no suporte médico que integra o fluxo terapêutico completo da clínica.</w:t>
+      </w:r>
+    </w:p>
+    <w:p>
+      <w:pPr>
+        <w:spacing w:before="0" w:after="80"/>
+        <w:ind w:left="283"/>
+        <w:jc w:val="both"/>
+      </w:pPr>
+      <w:r>
+        <w:rPr>
+          <w:rFonts w:ascii="Times New Roman" w:hAnsi="Times New Roman"/>
+          <w:b/>
+          <w:i w:val="0"/>
+          <w:sz w:val="22"/>
+        </w:rPr>
+        <w:t>§3º</w:t>
+      </w:r>
+      <w:r>
+        <w:rPr>
+          <w:rFonts w:ascii="Times New Roman" w:hAnsi="Times New Roman"/>
+          <w:b w:val="0"/>
+          <w:i w:val="0"/>
+          <w:sz w:val="22"/>
+        </w:rPr>
+        <w:t xml:space="preserve"> O Sócio A (Médico) não poderá executar diretamente os serviços de adaptação fisioterapêutica, mas participa da receita dessa categoria nos percentuais aqui estabelecidos, na condição de sócio e pelo papel clínico-complementar que exerce.</w:t>
       </w:r>
     </w:p>
     <w:p>
@@ -6572,7 +6597,7 @@
                 <w:i w:val="0"/>
                 <w:sz w:val="20"/>
               </w:rPr>
-              <w:t>0%</w:t>
+              <w:t>30%</w:t>
             </w:r>
           </w:p>
         </w:tc>
@@ -6592,7 +6617,7 @@
                 <w:i w:val="0"/>
                 <w:sz w:val="20"/>
               </w:rPr>
-              <w:t>100%</w:t>
+              <w:t>70%</w:t>
             </w:r>
           </w:p>
         </w:tc>

</xml_diff>